<commit_message>
docs: regenerate companion report, figures, memos and specs
Co-Authored-By: Claude Opus 4.8 <noreply@anthropic.com>
</commit_message>
<xml_diff>
--- a/docs/QSC_Atlas_Companion_Report.docx
+++ b/docs/QSC_Atlas_Companion_Report.docx
@@ -54,7 +54,7 @@
         <w:rPr>
           <w:sz w:val="20"/>
         </w:rPr>
-        <w:t>The QSC Atlas maps, country by country, how governments are rebuilding public-key cryptography against the prospect of a quantum computer able to break it. This report explains what the Atlas is, the standards-governance principles it rests on, and how to read its categories. It sets out a two-axis classification: a coordination posture, the collective transition a state belongs to, and a standards role, the state's relationship to the algorithms themselves. It explains what it means for a state to have transitioned as a setter, a contextualiser, a taker, or a sovereign developer, and why the coordination method and standards choice of each country carry theoretical, methodological, and geopolitical weight. The report documents the method behind the Atlas, including its use of AI assistance and its design for continuous updating, and classifies the 54 countries currently recorded.</w:t>
+        <w:t>The QSC Atlas maps, country by country, how governments are rebuilding public-key cryptography against the prospect of a quantum computer able to break it. This report explains what the Atlas is, the standards-governance principles it rests on, and how to read its categories. It sets out a two-axis classification: a coordination posture, the collective transition a state belongs to, and a standards role, the state's relationship to the algorithms themselves. It explains what it means for a state to have transitioned as a maker, a contextualiser, a taker, or a sovereign developer, and why the coordination method and standards choice of each country carry theoretical, methodological, and geopolitical weight. The report documents the method behind the Atlas, including its use of AI assistance and its design for continuous updating, and classifies the 54 countries currently recorded.</w:t>
       </w:r>
     </w:p>
     <w:p>
@@ -114,7 +114,7 @@
         <w:rPr>
           <w:i w:val="0"/>
         </w:rPr>
-        <w:t>The Atlas rests on the standards-governance literature, which treats technical standards as instruments of power with distributional consequences rather than neutral specifications. Buthe and Mattli (2011) show how first-mover advantage, institutional access and technical capacity determine whose preferences become embedded in global rules: a body that issues a technically mature proposal before competitors can mount an alternative sets the text around which others negotiate. Yates and Murphy (2019) trace the same pattern across a century of voluntary consensus standard-setting, in which widely adopted committee standards became de facto global norms without formal imposition.</w:t>
+        <w:t>The Atlas rests on the standards-governance literature, which treats technical standards as instruments of power with distributional consequences rather than neutral specifications. Buthe and Mattli (2011) show how first-mover advantage, institutional access and technical capacity determine whose preferences become embedded in global rules: a body that issues a technically mature proposal before competitors can mount an alternative writes the first draft around which others negotiate. Yates and Murphy (2019) trace the same pattern across a century of voluntary consensus standard-setting, in which widely adopted committee standards became de facto global norms without formal imposition.</w:t>
       </w:r>
     </w:p>
     <w:p>
@@ -125,7 +125,7 @@
         <w:rPr>
           <w:i w:val="0"/>
         </w:rPr>
-        <w:t>The post-quantum case reproduces that pattern. When the United States National Institute of Standards and Technology published its first three post-quantum standards in 2024 (NIST, 2024), a contested question about which algorithms count as quantum-safe became a settled technical fact that other jurisdictions either adopt or must interoperate with. Standards perform distinct economic functions, compatibility, quality, variety reduction, and information (Blind, 2013), and the post-quantum standards act chiefly as compatibility and quality standards. The comparative vocabulary the Atlas uses, standard-setter, standard-contextualiser, and standard-taker, follows from the power asymmetry that Buthe and Mattli (2011) describe rather than from a single published typology: a state can set the baseline, adopt it as given, or occupy an intermediate position of contextualisation. Bradford's (2020) account of the Brussels Effect, in which European regulation diffuses globally through market access, is the instructive contrast: in cryptography the direction reverses, because the standards originate in Washington and travel through the global deployment of United States technology firms, while European institutions contextualise rather than set.</w:t>
+        <w:t>The post-quantum case reproduces that pattern. When the United States National Institute of Standards and Technology published its first three post-quantum standards in 2024 (NIST, 2024), a contested question about which algorithms count as quantum-safe became a settled technical fact that other jurisdictions either adopt or must interoperate with. Standards perform distinct economic functions, compatibility, quality, variety reduction, and information (Blind, 2013), and the post-quantum standards act chiefly as compatibility and quality standards. The comparative vocabulary the Atlas uses, standard-maker, standard-contextualiser, and standard-taker, names three positions in the power asymmetry that Buthe and Mattli (2011) analyse when they ask who wins and who loses as standards are made: a state can make the baseline, adopt it as given, or occupy an intermediate position of contextualisation. The term standard-maker is the Atlas's own. It follows Yates and Murphy (2019), for whom standards are made through a consensus process by standardisers rather than decreed, and it locates the power, with Buthe and Mattli (2011), in who makes the baseline that others adopt. Bradford's (2020) account of the Brussels Effect, in which European regulation diffuses globally through market access, is the instructive contrast: in cryptography the direction reverses, because the standards originate in Washington and travel through the global deployment of United States technology firms, while European institutions contextualise rather than make.</w:t>
       </w:r>
     </w:p>
     <w:p>
@@ -155,7 +155,7 @@
         <w:rPr>
           <w:i w:val="0"/>
         </w:rPr>
-        <w:t>Every recorded country is described on two dimensions. The coordination posture answers which collective transition the country belongs to, and takes one of four values: the EU coordinated roadmap, the NIST-led bloc, a sovereign bloc, or engaged but unaligned. The standards role answers the country's relationship to the algorithms, and takes one of four values: standard-setter, standard-contextualiser, standard-taker, or sovereign developer. The posture is the map colour; the role is a profile badge.</w:t>
+        <w:t>Every recorded country is described on two dimensions. The coordination posture answers which collective transition the country belongs to, and takes one of four values: the EU coordinated roadmap, the NIST-led bloc, a sovereign bloc, or engaged but unaligned. The standards role answers the country's relationship to the algorithms, and takes one of four values: standard-maker, standard-contextualiser, standard-taker, or sovereign developer. The posture is the map colour; the role is a profile badge.</w:t>
       </w:r>
     </w:p>
     <w:p>
@@ -166,7 +166,7 @@
         <w:rPr>
           <w:i w:val="0"/>
         </w:rPr>
-        <w:t>The two are kept separate because one label cannot carry both without losing information. An EU member coordinates through the European roadmap, yet the algorithms it deploys are the NIST standards, since no European alternative exists. Describing it with a single camp forces a choice between the club it belongs to and the technology it runs. Figure 1 shows the pattern across the 54 countries. The sovereign bloc and the engaged group each sit on a single role, but the NIST and EU blocs split across roles: the United States is the lone setter inside the NIST bloc, France and Germany contextualise within the EU roadmap, and the majority of EU members are takers. That split is precisely what a one-colour scheme would hide.</w:t>
+        <w:t>The two are kept separate because one label cannot carry both without losing information. An EU member coordinates through the European roadmap, yet the algorithms it deploys are the NIST standards, since no European alternative exists. Describing it with a single camp forces a choice between the club it belongs to and the technology it runs. Figure 1 shows the pattern across the 54 countries. The sovereign bloc and the engaged group each sit on a single role, but the NIST and EU blocs split across roles: the United States is the lone maker inside the NIST bloc, France and Germany contextualise within the EU roadmap, and the majority of EU members are takers. That split is precisely what a one-colour scheme would hide.</w:t>
       </w:r>
     </w:p>
     <w:p>
@@ -176,7 +176,7 @@
       <w:r>
         <w:drawing>
           <wp:inline xmlns:a="http://schemas.openxmlformats.org/drawingml/2006/main" xmlns:pic="http://schemas.openxmlformats.org/drawingml/2006/picture">
-            <wp:extent cx="5760000" cy="2941821"/>
+            <wp:extent cx="5760000" cy="2928814"/>
             <wp:docPr id="1" name="Picture 1"/>
             <wp:cNvGraphicFramePr>
               <a:graphicFrameLocks noChangeAspect="1"/>
@@ -197,7 +197,7 @@
                   <pic:spPr>
                     <a:xfrm>
                       <a:off x="0" y="0"/>
-                      <a:ext cx="5760000" cy="2941821"/>
+                      <a:ext cx="5760000" cy="2928814"/>
                     </a:xfrm>
                     <a:prstGeom prst="rect"/>
                   </pic:spPr>
@@ -230,7 +230,7 @@
         <w:rPr>
           <w:i w:val="0"/>
         </w:rPr>
-        <w:t>Each value carries a plain meaning. A setter writes the baseline others adopt. A contextualiser accepts that baseline but adds national requirements, such as mandatory hybridisation, larger key sizes, or independent certification. A taker adopts the baseline broadly as published. A sovereign developer designs and mandates its own algorithms. On the coordination side, the EU roadmap is a coordination commitment under a shared timeline, the NIST-led bloc works to the United States cadence, the sovereign bloc runs an independent track, and the engaged-but-unaligned group is active on the transition without having committed to a bloc, a standard, or a timeline.</w:t>
+        <w:t>Each value carries a plain meaning. A maker writes the baseline others adopt. A contextualiser accepts that baseline but adds national requirements, such as mandatory hybridisation, larger key sizes, or independent certification. A taker adopts the baseline broadly as published. A sovereign developer designs and mandates its own algorithms. On the coordination side, the EU roadmap is a coordination commitment under a shared timeline, the NIST-led bloc works to the United States cadence, the sovereign bloc runs an independent track, and the engaged-but-unaligned group is active on the transition without having committed to a bloc, a standard, or a timeline.</w:t>
       </w:r>
     </w:p>
     <w:p>
@@ -362,7 +362,7 @@
         <w:rPr>
           <w:i w:val="0"/>
         </w:rPr>
-        <w:t>Read by coordination bloc, the 54 recorded countries fall into four groups of very different size (Figure 2). The EU coordinated roadmap is the largest at 27 members, the NIST-led bloc follows at 15, nine countries are engaged but unaligned, and three form the sovereign bloc. Read by standards role (Figure 3), the asymmetry is sharper still: one country sets the baseline, six contextualise it, 35 take it, three build their own, and nine have not yet declared a role.</w:t>
+        <w:t>Read by coordination bloc, the 54 recorded countries fall into four groups of very different size (Figure 2). The EU coordinated roadmap is the largest at 27 members, the NIST-led bloc follows at 16, eight countries are engaged but unaligned, and three form the sovereign bloc. Read by standards role (Figure 3), the asymmetry is sharper still: one country makes the baseline, seven contextualise it, 35 take it, three build their own, and eight have not yet declared a role.</w:t>
       </w:r>
     </w:p>
     <w:p>
@@ -425,7 +425,7 @@
       <w:r>
         <w:drawing>
           <wp:inline xmlns:a="http://schemas.openxmlformats.org/drawingml/2006/main" xmlns:pic="http://schemas.openxmlformats.org/drawingml/2006/picture">
-            <wp:extent cx="5220000" cy="2218702"/>
+            <wp:extent cx="5220000" cy="2206764"/>
             <wp:docPr id="4" name="Picture 4"/>
             <wp:cNvGraphicFramePr>
               <a:graphicFrameLocks noChangeAspect="1"/>
@@ -446,7 +446,7 @@
                   <pic:spPr>
                     <a:xfrm>
                       <a:off x="0" y="0"/>
-                      <a:ext cx="5220000" cy="2218702"/>
+                      <a:ext cx="5220000" cy="2206764"/>
                     </a:xfrm>
                     <a:prstGeom prst="rect"/>
                   </pic:spPr>
@@ -468,7 +468,7 @@
           <w:color w:val="5C5C5C"/>
           <w:sz w:val="18"/>
         </w:rPr>
-        <w:t>Figure 3. Countries by standards role: one setter, many takers.</w:t>
+        <w:t>Figure 3. Countries by standards role: one maker, many takers.</w:t>
       </w:r>
     </w:p>
     <w:p>
@@ -479,7 +479,7 @@
         <w:rPr>
           <w:i w:val="0"/>
         </w:rPr>
-        <w:t>The United States is the sole standard-setter. To have transitioned as a setter is to write the algorithms the rest of the world references and to bind one's own agencies to them, while the private sector follows through procurement and global product deployment rather than a single mandate. The EU coordinated roadmap is a coordination bloc, not a standards bloc: France and Germany contextualise the baseline through national certification and technical guidance, while the majority of members are takers. To have transitioned as an EU taker is to be bound by the Union's general obligations under NIS2 and DORA, to migrate on the shared 2030 and 2035 timeline, and to run the NIST algorithms with little national overlay.</w:t>
+        <w:t>The United States is the sole standard-maker. To have transitioned as a maker is to write the algorithms the rest of the world references and to bind one's own agencies to them, while the private sector follows through procurement and global product deployment rather than a single mandate. The EU coordinated roadmap is a coordination bloc, not a standards bloc: France and Germany contextualise the baseline through national certification and technical guidance, while the majority of members are takers. To have transitioned as an EU taker is to be bound by the Union's general obligations under NIS2 and DORA, to migrate on the shared 2030 and 2035 timeline, and to run the NIST algorithms with little national overlay.</w:t>
       </w:r>
     </w:p>
     <w:p>
@@ -490,7 +490,7 @@
         <w:rPr>
           <w:i w:val="0"/>
         </w:rPr>
-        <w:t>The NIST-led bloc gathers the adopters outside the European coordination, including the United Kingdom and Canada. Four of its members contextualise rather than simply take: India, Japan and Singapore add national certification and sectoral guidance, and South Korea runs its own national competition that selects algorithms cognate with the NIST suite while keeping interoperability with it. The sovereign bloc is the small group that genuinely forks the baseline. China, Russia and Vietnam develop and mandate their own algorithms, and to have transitioned this way is to accept the interoperability and market-access costs of a parallel standards track in exchange for cryptographic independence. The nine engaged-but-unaligned states are active on the transition but have named no standard or timeline; recording them as undecided keeps the size of each committed bloc honest rather than inflating the NIST orbit with countries that have not chosen.</w:t>
+        <w:t>The NIST-led bloc gathers the adopters outside the European coordination, including the United Kingdom and Canada. Five of its members contextualise rather than simply take: Australia, India, Japan and Singapore add national certification and sectoral guidance, and South Korea runs its own national competition that selects algorithms cognate with the NIST suite while keeping interoperability with it. The sovereign bloc is the small group that genuinely forks the baseline. China, Russia and Vietnam develop and mandate their own algorithms, and to have transitioned this way is to accept the interoperability and market-access costs of a parallel standards track in exchange for cryptographic independence. The eight engaged-but-unaligned states are active on the transition but have named no standard or timeline; recording them as undecided keeps the size of each committed bloc honest rather than inflating the NIST orbit with countries that have not chosen.</w:t>
       </w:r>
     </w:p>
     <w:p>
@@ -531,7 +531,7 @@
         <w:rPr>
           <w:i w:val="0"/>
         </w:rPr>
-        <w:t>The geopolitical interest is the most direct. Whoever sets the baseline holds structural power over the terms on which everyone else secures their systems (Buthe and Mattli, 2011), which is why the single-setter finding is the central fact of the field rather than a detail. The sovereign fork raises the prospect of competing spheres of cryptographic interoperability, where divergence in the underlying standards becomes a barrier to market access. Trade agreements have themselves extended into regulatory territory in ways that distribute advantage to the already established (Rodrik, 2018). The European position as contextualiser, and the contested middle of states that have not yet chosen, are where the shape of the next few years will be decided.</w:t>
+        <w:t>The geopolitical interest is the most direct. Whoever makes the baseline holds structural power over the terms on which everyone else secures their systems (Buthe and Mattli, 2011), which is why the single-maker finding is the central fact of the field rather than a detail. The sovereign fork raises the prospect of competing spheres of cryptographic interoperability, where divergence in the underlying standards becomes a barrier to market access. Trade agreements have themselves extended into regulatory territory in ways that distribute advantage to the already established (Rodrik, 2018). The European position as contextualiser, and the contested middle of states that have not yet chosen, are where the shape of the next few years will be decided.</w:t>
       </w:r>
     </w:p>
     <w:p>
@@ -889,7 +889,7 @@
                 <w:color w:val="1A1A1A"/>
                 <w:sz w:val="16"/>
               </w:rPr>
-              <w:t>Standard-taker</w:t>
+              <w:t>Standard-contextualiser</w:t>
             </w:r>
           </w:p>
         </w:tc>
@@ -946,7 +946,7 @@
                 <w:color w:val="1A1A1A"/>
                 <w:sz w:val="16"/>
               </w:rPr>
-              <w:t xml:space="preserve">Non-corporate Commonwealth entities must, under PSPF Policy 11, secure their ICT systems by applying the cyber security principles and risk-based approach of the Australian Government Information Security Manual, which the PSPF makes mandatory under the Public Governance, Performance and Accountability Act 2013; responsible entities for critical infrastructure assets must also maintain a risk management programme addressing cyber and information security hazards under the Security of Critical Infrastructure Act 2018. Neither instrument compels post-quantum migration: PQC is addressed through ASD/ACSC guidance aligned to the NIST algorithms, on an indicative timeline to 2030, with no binding obligation. </w:t>
+              <w:t xml:space="preserve">Non-corporate Commonwealth entities must, under PSPF Policy 11, secure their ICT systems by applying the cyber security principles and risk-based approach of the Australian Government Information Security Manual, which the PSPF makes mandatory under the Public Governance, Performance and Accountability Act 2013; responsible entities for critical infrastructure assets must also maintain a risk management programme addressing cyber and information security hazards under the Security of Critical Infrastructure Act 2018. The Information Security Manual, mandatory for these entities, embeds an end-of-2030 retirement of the classical asymmetric algorithms (RSA, Diffie-Hellman, ECDH, ECDSA) and approves the NIST post-quantum algorithms; for Commonwealth systems this makes migration to post-quantum cryptography effectively binding on a 2030 deadline, ahead of the global 2035 horizon, while the wider economy follows ASD guidance. </w:t>
             </w:r>
           </w:p>
         </w:tc>
@@ -6206,7 +6206,7 @@
                 <w:color w:val="1A1A1A"/>
                 <w:sz w:val="16"/>
               </w:rPr>
-              <w:t>Engaged, unaligned</w:t>
+              <w:t>NIST bloc</w:t>
             </w:r>
           </w:p>
         </w:tc>
@@ -6225,7 +6225,7 @@
                 <w:color w:val="1A1A1A"/>
                 <w:sz w:val="16"/>
               </w:rPr>
-              <w:t>Not yet declared</w:t>
+              <w:t>Standard-taker</w:t>
             </w:r>
           </w:p>
         </w:tc>
@@ -6244,7 +6244,7 @@
                 <w:color w:val="1A1A1A"/>
                 <w:sz w:val="16"/>
               </w:rPr>
-              <w:t>None</w:t>
+              <w:t>Soft law only</w:t>
             </w:r>
           </w:p>
         </w:tc>
@@ -6282,7 +6282,7 @@
                 <w:color w:val="1A1A1A"/>
                 <w:sz w:val="16"/>
               </w:rPr>
-              <w:t xml:space="preserve">No binding post-quantum obligation is on record. Engagement to date is limited to awareness or research activity, with no national standard, instrument, or migration timeline adopted. </w:t>
+              <w:t xml:space="preserve">There is no binding post-quantum mandate. Thailand's National Cyber Security Agency (NCSA), through its QUANTA platform, issues guidance recommending migration to the NIST post-quantum standards (ML-KEM, ML-DSA, SLH-DSA) on a phased national roadmap to 2035. This is guidance rather than a legal obligation. </w:t>
             </w:r>
           </w:p>
         </w:tc>
@@ -6805,7 +6805,7 @@
                 <w:color w:val="1A1A1A"/>
                 <w:sz w:val="16"/>
               </w:rPr>
-              <w:t>Standard-setter</w:t>
+              <w:t>Standard-maker</w:t>
             </w:r>
           </w:p>
         </w:tc>

</xml_diff>